<commit_message>
Contratos marco v3: licencia supletoria con usos concretos, inicio objetivo del plazo de aceptación; control interno de compras
Co-Authored-By: Claude Opus 5.5 <noreply@anthropic.com>
Claude-Session: https://claude.ai/code/session_01V7BfzBTA8TEWMK1apGBBKC
</commit_message>
<xml_diff>
--- a/casos/laboral-kcarmona/escritos/2026-10-27_Propuesta_Contrato_Marco_Herramientas_Digitales_AAlcazar.docx
+++ b/casos/laboral-kcarmona/escritos/2026-10-27_Propuesta_Contrato_Marco_Herramientas_Digitales_AAlcazar.docx
@@ -168,7 +168,7 @@
           <w:color w:val="2F2E47"/>
           <w:sz w:val="21"/>
         </w:rPr>
-        <w:t>No forman parte de este contrato las hojas de cálculo, los registros ni los reportes que la Proveedora prepara o actualiza como parte de su trabajo, aunque para ello use productos adquiridos mediante este contrato.</w:t>
+        <w:t>No forman parte de este contrato las hojas de cálculo, los registros ni los reportes que la Proveedora prepara o actualiza como parte de su trabajo, aunque para ello use productos adquiridos mediante este contrato. Tampoco se adquieren por esta vía productos elaborados como parte de una tarea asignada en su puesto.</w:t>
       </w:r>
     </w:p>
     <w:p>
@@ -393,7 +393,7 @@
           <w:color w:val="2F2E47"/>
           <w:sz w:val="21"/>
         </w:rPr>
-        <w:t>La entrega es completa cuando la Adquirente recibe, por el canal indicado en la orden, el archivo editable, con sus fórmulas y automatizaciones accesibles, y una guía breve de uso. Desde ese momento dispone de cinco días hábiles para aceptar el producto o formular observaciones concretas, referidas a los criterios de la orden.</w:t>
+        <w:t>La entrega se hace en el correo o la carpeta digital que designe la orden, y es completa cuando comprende el archivo editable, con sus fórmulas y automatizaciones accesibles, y una guía breve de uso. Desde la fecha de envío registrada en ese canal, la Adquirente dispone de cinco días hábiles para aceptar el producto o formular observaciones concretas, referidas a los criterios de la orden.</w:t>
       </w:r>
     </w:p>
     <w:p>
@@ -497,7 +497,7 @@
           <w:color w:val="2F2E47"/>
           <w:sz w:val="21"/>
         </w:rPr>
-        <w:t>Cada orden indica si la Adquirente adquiere los derechos patrimoniales del producto o una licencia de uso, y precisa las modalidades de utilización (reproducción, distribución, comunicación pública y transformación, incluidas la modificación y la adaptación de fórmulas y automatizaciones), la exclusividad, el territorio y la duración.</w:t>
+        <w:t>Cada orden identifica el producto e indica si la Adquirente adquiere los derechos patrimoniales o una licencia de uso. Si la Adquirente requiere ser titular de esos derechos, la orden lo pacta como cesión expresa.</w:t>
       </w:r>
     </w:p>
     <w:p>
@@ -511,7 +511,21 @@
           <w:color w:val="2F2E47"/>
           <w:sz w:val="21"/>
         </w:rPr>
-        <w:t>Si la orden no precisa alguno de esos elementos, se entiende concedida a la Adquirente una licencia exclusiva para sus fines institucionales, en cualquier medio y territorio, por todo el plazo de protección legal.</w:t>
+        <w:t>Salvo que la orden disponga otra cosa, la Proveedora concede a la Adquirente una licencia exclusiva, de alcance mundial y por todo el plazo de protección legal, para reproducir, instalar, usar, modificar y adaptar el producto, incluidas sus fórmulas y automatizaciones, en las operaciones de Grupo Poïesis y de sus sedes.</w:t>
+      </w:r>
+    </w:p>
+    <w:p>
+      <w:pPr>
+        <w:spacing w:before="0" w:after="120" w:line="300" w:lineRule="auto"/>
+      </w:pPr>
+      <w:r>
+        <w:rPr>
+          <w:rFonts w:ascii="Georgia" w:hAnsi="Georgia"/>
+          <w:b w:val="0"/>
+          <w:color w:val="2F2E47"/>
+          <w:sz w:val="21"/>
+        </w:rPr>
+        <w:t>La orden puede ampliar, limitar o precisar los derechos concedidos.</w:t>
       </w:r>
     </w:p>
     <w:p>

</xml_diff>

<commit_message>
Escritos Word: la firma no queda sola en una página
Co-Authored-By: Claude Opus 5.5 <noreply@anthropic.com>
Claude-Session: https://claude.ai/code/session_01V7BfzBTA8TEWMK1apGBBKC
</commit_message>
<xml_diff>
--- a/casos/laboral-kcarmona/escritos/2026-10-27_Propuesta_Contrato_Marco_Herramientas_Digitales_AAlcazar.docx
+++ b/casos/laboral-kcarmona/escritos/2026-10-27_Propuesta_Contrato_Marco_Herramientas_Digitales_AAlcazar.docx
@@ -797,6 +797,7 @@
     </w:p>
     <w:p>
       <w:pPr>
+        <w:keepNext/>
         <w:spacing w:before="0" w:after="120" w:line="300" w:lineRule="auto"/>
       </w:pPr>
       <w:r>
@@ -828,6 +829,7 @@
     </w:p>
     <w:p>
       <w:pPr>
+        <w:keepNext/>
         <w:spacing w:before="0" w:after="120" w:line="300" w:lineRule="auto"/>
       </w:pPr>
       <w:r>
@@ -842,6 +844,7 @@
     </w:p>
     <w:p>
       <w:pPr>
+        <w:keepNext/>
         <w:spacing w:before="0" w:after="120" w:line="300" w:lineRule="auto"/>
       </w:pPr>
       <w:r>
@@ -854,7 +857,11 @@
         <w:t>Firmamos en dos tantos de igual valor, en San José, el ____ de ______________ de 2026.</w:t>
       </w:r>
     </w:p>
-    <w:p/>
+    <w:p>
+      <w:pPr>
+        <w:keepNext/>
+      </w:pPr>
+    </w:p>
     <w:tbl>
       <w:tblPr>
         <w:tblW w:type="auto" w:w="0"/>

</xml_diff>

<commit_message>
Lectura del contrato con Kristell: audio, transcripción, R-066, R-067, E-021; contratos marco v8 para firma
Co-Authored-By: Claude Opus 5.5 <noreply@anthropic.com>
Claude-Session: https://claude.ai/code/session_01V7BfzBTA8TEWMK1apGBBKC
</commit_message>
<xml_diff>
--- a/casos/laboral-kcarmona/escritos/2026-10-27_Propuesta_Contrato_Marco_Herramientas_Digitales_AAlcazar.docx
+++ b/casos/laboral-kcarmona/escritos/2026-10-27_Propuesta_Contrato_Marco_Herramientas_Digitales_AAlcazar.docx
@@ -28,7 +28,7 @@
           <w:color w:val="5C6684"/>
           <w:sz w:val="20"/>
         </w:rPr>
-        <w:t>Propuesta para revisión, entregada el 27 de octubre de 2026. No se solicita su firma en esta fecha.</w:t>
+        <w:t>Propuesta entregada el ____ de ______________ de 2026. La Proveedora puede revisarla y consultarla con quien desee antes de firmar. La propuesta se mantiene vigente durante quince días hábiles desde su entrega.</w:t>
       </w:r>
     </w:p>
     <w:p>
@@ -345,7 +345,21 @@
           <w:color w:val="2F2E47"/>
           <w:sz w:val="21"/>
         </w:rPr>
-        <w:t>No existe un número mínimo de órdenes ni un pago periódico garantizado.</w:t>
+        <w:t>Una orden puede comprender uno o varios productos. El precio de cada producto es el del anexo 3, salvo que la orden fije otro de común acuerdo.</w:t>
+      </w:r>
+    </w:p>
+    <w:p>
+      <w:pPr>
+        <w:spacing w:before="0" w:after="120" w:line="300" w:lineRule="auto"/>
+      </w:pPr>
+      <w:r>
+        <w:rPr>
+          <w:rFonts w:ascii="Georgia" w:hAnsi="Georgia"/>
+          <w:b w:val="0"/>
+          <w:color w:val="2F2E47"/>
+          <w:sz w:val="21"/>
+        </w:rPr>
+        <w:t>No existe un número mínimo de órdenes ni un pago periódico garantizado. El máximo mensual del anexo 3 es una previsión de compra, no un compromiso.</w:t>
       </w:r>
     </w:p>
     <w:p>
@@ -376,7 +390,7 @@
           <w:color w:val="2F2E47"/>
           <w:sz w:val="21"/>
         </w:rPr>
-        <w:t>Si un producto requiere usar equipos, sistemas o licencias de la Adquirente, la autorización consta por escrito en la orden, con los recursos y el periodo de uso, fuera de la jornada laboral de la Proveedora.</w:t>
+        <w:t>Si un producto requiere usar equipos, sistemas, programas o licencias de la Adquirente, la autorización consta por escrito en la orden, con los recursos y el periodo de uso, fuera de la jornada laboral de la Proveedora.</w:t>
       </w:r>
     </w:p>
     <w:p>
@@ -522,7 +536,7 @@
           <w:color w:val="2F2E47"/>
           <w:sz w:val="21"/>
         </w:rPr>
-        <w:t>Cada parte cumple las obligaciones tributarias y de seguridad social que le correspondan por ley.</w:t>
+        <w:t>La Proveedora puede emitir un solo comprobante por orden, aunque la orden comprenda varios productos. Cada parte cumple las obligaciones tributarias y de seguridad social que le correspondan por ley.</w:t>
       </w:r>
     </w:p>
     <w:p>
@@ -623,7 +637,7 @@
           <w:color w:val="2F2E47"/>
           <w:sz w:val="21"/>
         </w:rPr>
-        <w:t>La entrega del archivo no transmite derechos distintos de los pactados. La Proveedora conserva los derechos morales que la ley le reconoce como autora.</w:t>
+        <w:t>La entrega del archivo no transmite derechos distintos de los pactados. La Proveedora conserva los derechos morales que la ley le reconoce como autora. Puede identificar su autoría en la documentación de cada herramienta.</w:t>
       </w:r>
     </w:p>
     <w:p>
@@ -772,7 +786,35 @@
           <w:color w:val="2F2E47"/>
           <w:sz w:val="21"/>
         </w:rPr>
-        <w:t>Este contrato rige por un año desde su firma y se renueva automáticamente por periodos iguales, salvo que una de las partes comunique por escrito lo contrario con quince días naturales de anticipación. Las órdenes aceptadas antes del aviso se cumplen en sus términos.</w:t>
+        <w:t>Este contrato rige por un año desde su firma y se renueva automáticamente por periodos iguales, salvo que una de las partes comunique por escrito lo contrario con quince días naturales de anticipación.</w:t>
+      </w:r>
+    </w:p>
+    <w:p>
+      <w:pPr>
+        <w:spacing w:before="0" w:after="120" w:line="300" w:lineRule="auto"/>
+      </w:pPr>
+      <w:r>
+        <w:rPr>
+          <w:rFonts w:ascii="Georgia" w:hAnsi="Georgia"/>
+          <w:b w:val="0"/>
+          <w:color w:val="2F2E47"/>
+          <w:sz w:val="21"/>
+        </w:rPr>
+        <w:t>Cualquiera de las partes puede darlo por terminado en cualquier momento, con aviso escrito de quince días naturales, sin penalidad ni indemnización. Las órdenes aceptadas antes del aviso se cumplen en sus términos.</w:t>
+      </w:r>
+    </w:p>
+    <w:p>
+      <w:pPr>
+        <w:spacing w:before="0" w:after="120" w:line="300" w:lineRule="auto"/>
+      </w:pPr>
+      <w:r>
+        <w:rPr>
+          <w:rFonts w:ascii="Georgia" w:hAnsi="Georgia"/>
+          <w:b w:val="0"/>
+          <w:color w:val="2F2E47"/>
+          <w:sz w:val="21"/>
+        </w:rPr>
+        <w:t>La terminación de la relación laboral, por cualquier causa, no termina este contrato, y la terminación de este contrato no afecta la relación laboral.</w:t>
       </w:r>
     </w:p>
     <w:p>
@@ -1710,6 +1752,178 @@
       </w:tr>
     </w:tbl>
     <w:p/>
+    <w:p>
+      <w:pPr>
+        <w:keepNext/>
+        <w:spacing w:before="280" w:after="120" w:line="300" w:lineRule="auto"/>
+        <w:pageBreakBefore/>
+        <w:pBdr>
+          <w:bottom w:val="single" w:sz="6" w:space="4" w:color="D1D0CB"/>
+        </w:pBdr>
+      </w:pPr>
+      <w:r>
+        <w:rPr>
+          <w:rFonts w:ascii="Safira March" w:hAnsi="Safira March"/>
+          <w:color w:val="131237"/>
+          <w:sz w:val="28"/>
+        </w:rPr>
+        <w:t>Anexo 3. Tarifas</w:t>
+      </w:r>
+    </w:p>
+    <w:tbl>
+      <w:tblPr>
+        <w:tblW w:type="auto" w:w="0"/>
+        <w:jc w:val="center"/>
+        <w:tblLook w:firstColumn="1" w:firstRow="1" w:lastColumn="0" w:lastRow="0" w:noHBand="0" w:noVBand="1" w:val="04A0"/>
+        <w:tblBorders>
+          <w:top w:val="nil"/>
+          <w:left w:val="nil"/>
+          <w:bottom w:val="nil"/>
+          <w:right w:val="nil"/>
+          <w:insideH w:val="nil"/>
+          <w:insideV w:val="nil"/>
+        </w:tblBorders>
+      </w:tblPr>
+      <w:tblGrid>
+        <w:gridCol w:w="4536"/>
+        <w:gridCol w:w="4536"/>
+      </w:tblGrid>
+      <w:tr>
+        <w:tc>
+          <w:tcPr>
+            <w:tcW w:type="dxa" w:w="4536"/>
+          </w:tcPr>
+          <w:p>
+            <w:pPr>
+              <w:spacing w:before="40" w:after="40" w:line="264" w:lineRule="auto"/>
+            </w:pPr>
+            <w:r>
+              <w:rPr>
+                <w:rFonts w:ascii="Georgia" w:hAnsi="Georgia"/>
+                <w:b w:val="0"/>
+                <w:color w:val="5C6684"/>
+                <w:sz w:val="19"/>
+              </w:rPr>
+              <w:t>Producto</w:t>
+            </w:r>
+          </w:p>
+        </w:tc>
+        <w:tc>
+          <w:tcPr>
+            <w:tcW w:type="dxa" w:w="4536"/>
+          </w:tcPr>
+          <w:p>
+            <w:pPr>
+              <w:spacing w:before="40" w:after="40" w:line="264" w:lineRule="auto"/>
+            </w:pPr>
+            <w:r>
+              <w:rPr>
+                <w:rFonts w:ascii="Georgia" w:hAnsi="Georgia"/>
+                <w:b w:val="0"/>
+                <w:color w:val="2F2E47"/>
+                <w:sz w:val="19"/>
+              </w:rPr>
+              <w:t>Herramienta digital, según la orden</w:t>
+            </w:r>
+          </w:p>
+        </w:tc>
+      </w:tr>
+      <w:tr>
+        <w:tc>
+          <w:tcPr>
+            <w:tcW w:type="dxa" w:w="4536"/>
+          </w:tcPr>
+          <w:p>
+            <w:pPr>
+              <w:spacing w:before="40" w:after="40" w:line="264" w:lineRule="auto"/>
+            </w:pPr>
+            <w:r>
+              <w:rPr>
+                <w:rFonts w:ascii="Georgia" w:hAnsi="Georgia"/>
+                <w:b w:val="0"/>
+                <w:color w:val="5C6684"/>
+                <w:sz w:val="19"/>
+              </w:rPr>
+              <w:t>Precio por producto</w:t>
+            </w:r>
+          </w:p>
+        </w:tc>
+        <w:tc>
+          <w:tcPr>
+            <w:tcW w:type="dxa" w:w="4536"/>
+          </w:tcPr>
+          <w:p>
+            <w:pPr>
+              <w:spacing w:before="40" w:after="40" w:line="264" w:lineRule="auto"/>
+            </w:pPr>
+            <w:r>
+              <w:rPr>
+                <w:rFonts w:ascii="Georgia" w:hAnsi="Georgia"/>
+                <w:b w:val="0"/>
+                <w:color w:val="2F2E47"/>
+                <w:sz w:val="19"/>
+              </w:rPr>
+              <w:t>₡ ______ (más IVA, si corresponde)</w:t>
+            </w:r>
+          </w:p>
+        </w:tc>
+      </w:tr>
+      <w:tr>
+        <w:tc>
+          <w:tcPr>
+            <w:tcW w:type="dxa" w:w="4536"/>
+          </w:tcPr>
+          <w:p>
+            <w:pPr>
+              <w:spacing w:before="40" w:after="40" w:line="264" w:lineRule="auto"/>
+            </w:pPr>
+            <w:r>
+              <w:rPr>
+                <w:rFonts w:ascii="Georgia" w:hAnsi="Georgia"/>
+                <w:b w:val="0"/>
+                <w:color w:val="5C6684"/>
+                <w:sz w:val="19"/>
+              </w:rPr>
+              <w:t>Máximo de productos por mes</w:t>
+            </w:r>
+          </w:p>
+        </w:tc>
+        <w:tc>
+          <w:tcPr>
+            <w:tcW w:type="dxa" w:w="4536"/>
+          </w:tcPr>
+          <w:p>
+            <w:pPr>
+              <w:spacing w:before="40" w:after="40" w:line="264" w:lineRule="auto"/>
+            </w:pPr>
+            <w:r>
+              <w:rPr>
+                <w:rFonts w:ascii="Georgia" w:hAnsi="Georgia"/>
+                <w:b w:val="0"/>
+                <w:color w:val="2F2E47"/>
+                <w:sz w:val="19"/>
+              </w:rPr>
+              <w:t>______</w:t>
+            </w:r>
+          </w:p>
+        </w:tc>
+      </w:tr>
+    </w:tbl>
+    <w:p/>
+    <w:p>
+      <w:pPr>
+        <w:spacing w:before="0" w:after="120" w:line="300" w:lineRule="auto"/>
+      </w:pPr>
+      <w:r>
+        <w:rPr>
+          <w:rFonts w:ascii="Georgia" w:hAnsi="Georgia"/>
+          <w:b w:val="0"/>
+          <w:color w:val="2F2E47"/>
+          <w:sz w:val="21"/>
+        </w:rPr>
+        <w:t>Las tarifas rigen durante el primer año de vigencia del contrato. Cualquier cambio se acuerda por escrito. El máximo mensual es una previsión de compra de la Adquirente: no obliga a ninguna de las partes a ofrecer, elaborar ni adquirir un número determinado de productos.</w:t>
+      </w:r>
+    </w:p>
     <w:sectPr>
       <w:headerReference w:type="default" r:id="rId9"/>
       <w:footerReference w:type="default" r:id="rId10"/>

</xml_diff>